<commit_message>
Update to the project structure and added new ETL scripts for healthcare data processing. Updated documentation files to reflect the changes in the data pipeline and added a new SQL script for data transformation from bronze to silver layer. And Silver to Gold,
</commit_message>
<xml_diff>
--- a/Health_Project_Details.docx
+++ b/Health_Project_Details.docx
@@ -65,15 +65,7 @@
         <w:ind w:left="720"/>
       </w:pPr>
       <w:r>
-        <w:t xml:space="preserve">The system should provide clear insights into nurse-to-patient ratios, total working hours, and overtime trends by hospital and state. It should also help us track hospital occupancy, bed utilization, and identify where staffing levels are not aligned with patient load. We want to understand how staffing patterns impact outcomes such as readmissions and length of </w:t>
-      </w:r>
-      <w:proofErr w:type="gramStart"/>
-      <w:r>
-        <w:t>stay, and</w:t>
-      </w:r>
-      <w:proofErr w:type="gramEnd"/>
-      <w:r>
-        <w:t xml:space="preserve"> identify hospitals with high overtime or low staff-to-patient coverage. </w:t>
+        <w:t xml:space="preserve">The system should provide clear insights into nurse-to-patient ratios, total working hours, and overtime trends by hospital and state. It should also help us track hospital occupancy, bed utilization, and identify where staffing levels are not aligned with patient load. We want to understand how staffing patterns impact outcomes such as readmissions and length of stay, and identify hospitals with high overtime or low staff-to-patient coverage. </w:t>
       </w:r>
     </w:p>
     <w:p>
@@ -83,6 +75,1567 @@
       </w:pPr>
       <w:r>
         <w:t>All these insights should be available through an interactive dashboard to help management improve workforce planning, optimize costs, and maintain high-quality patient care across the network.</w:t>
+      </w:r>
+      <w:r>
+        <w:tab/>
+      </w:r>
+      <w:r>
+        <w:tab/>
+      </w:r>
+      <w:r>
+        <w:tab/>
+      </w:r>
+      <w:r>
+        <w:tab/>
+      </w:r>
+      <w:r>
+        <w:tab/>
+      </w:r>
+      <w:r>
+        <w:tab/>
+      </w:r>
+      <w:r>
+        <w:tab/>
+      </w:r>
+      <w:r>
+        <w:tab/>
+      </w:r>
+      <w:r>
+        <w:tab/>
+      </w:r>
+      <w:r>
+        <w:tab/>
+      </w:r>
+      <w:r>
+        <w:tab/>
+      </w:r>
+      <w:r>
+        <w:tab/>
+      </w:r>
+      <w:r>
+        <w:tab/>
+      </w:r>
+      <w:r>
+        <w:tab/>
+      </w:r>
+      <w:r>
+        <w:tab/>
+      </w:r>
+      <w:r>
+        <w:tab/>
+      </w:r>
+      <w:r>
+        <w:tab/>
+      </w:r>
+      <w:r>
+        <w:tab/>
+      </w:r>
+      <w:r>
+        <w:tab/>
+      </w:r>
+      <w:r>
+        <w:tab/>
+      </w:r>
+      <w:r>
+        <w:tab/>
+      </w:r>
+      <w:r>
+        <w:tab/>
+      </w:r>
+      <w:r>
+        <w:tab/>
+      </w:r>
+      <w:r>
+        <w:tab/>
+      </w:r>
+      <w:r>
+        <w:tab/>
+      </w:r>
+      <w:r>
+        <w:tab/>
+      </w:r>
+      <w:r>
+        <w:tab/>
+      </w:r>
+      <w:r>
+        <w:tab/>
+      </w:r>
+      <w:r>
+        <w:tab/>
+      </w:r>
+      <w:r>
+        <w:tab/>
+      </w:r>
+      <w:r>
+        <w:tab/>
+      </w:r>
+      <w:r>
+        <w:tab/>
+      </w:r>
+      <w:r>
+        <w:tab/>
+      </w:r>
+      <w:r>
+        <w:tab/>
+      </w:r>
+      <w:r>
+        <w:tab/>
+      </w:r>
+      <w:r>
+        <w:tab/>
+      </w:r>
+      <w:r>
+        <w:tab/>
+      </w:r>
+      <w:r>
+        <w:tab/>
+      </w:r>
+      <w:r>
+        <w:tab/>
+      </w:r>
+      <w:r>
+        <w:tab/>
+      </w:r>
+      <w:r>
+        <w:tab/>
+      </w:r>
+      <w:r>
+        <w:tab/>
+      </w:r>
+      <w:r>
+        <w:tab/>
+      </w:r>
+      <w:r>
+        <w:tab/>
+      </w:r>
+      <w:r>
+        <w:tab/>
+      </w:r>
+      <w:r>
+        <w:tab/>
+      </w:r>
+      <w:r>
+        <w:tab/>
+      </w:r>
+      <w:r>
+        <w:tab/>
+      </w:r>
+      <w:r>
+        <w:tab/>
+      </w:r>
+      <w:r>
+        <w:tab/>
+      </w:r>
+      <w:r>
+        <w:tab/>
+      </w:r>
+      <w:r>
+        <w:tab/>
+      </w:r>
+      <w:r>
+        <w:tab/>
+      </w:r>
+      <w:r>
+        <w:tab/>
+      </w:r>
+      <w:r>
+        <w:tab/>
+      </w:r>
+      <w:r>
+        <w:tab/>
+      </w:r>
+      <w:r>
+        <w:tab/>
+      </w:r>
+      <w:r>
+        <w:tab/>
+      </w:r>
+      <w:r>
+        <w:tab/>
+      </w:r>
+      <w:r>
+        <w:tab/>
+      </w:r>
+      <w:r>
+        <w:tab/>
+      </w:r>
+      <w:r>
+        <w:tab/>
+      </w:r>
+      <w:r>
+        <w:tab/>
+      </w:r>
+      <w:r>
+        <w:tab/>
+      </w:r>
+      <w:r>
+        <w:tab/>
+      </w:r>
+      <w:r>
+        <w:tab/>
+      </w:r>
+      <w:r>
+        <w:tab/>
+      </w:r>
+      <w:r>
+        <w:tab/>
+      </w:r>
+      <w:r>
+        <w:tab/>
+      </w:r>
+      <w:r>
+        <w:tab/>
+      </w:r>
+      <w:r>
+        <w:tab/>
+      </w:r>
+      <w:r>
+        <w:tab/>
+      </w:r>
+      <w:r>
+        <w:tab/>
+      </w:r>
+      <w:r>
+        <w:tab/>
+      </w:r>
+      <w:r>
+        <w:tab/>
+      </w:r>
+      <w:r>
+        <w:tab/>
+      </w:r>
+      <w:r>
+        <w:tab/>
+      </w:r>
+      <w:r>
+        <w:tab/>
+      </w:r>
+      <w:r>
+        <w:tab/>
+      </w:r>
+      <w:r>
+        <w:tab/>
+      </w:r>
+      <w:r>
+        <w:tab/>
+      </w:r>
+      <w:r>
+        <w:tab/>
+      </w:r>
+      <w:r>
+        <w:tab/>
+      </w:r>
+      <w:r>
+        <w:tab/>
+      </w:r>
+      <w:r>
+        <w:tab/>
+      </w:r>
+      <w:r>
+        <w:tab/>
+      </w:r>
+      <w:r>
+        <w:tab/>
+      </w:r>
+      <w:r>
+        <w:tab/>
+      </w:r>
+      <w:r>
+        <w:tab/>
+      </w:r>
+      <w:r>
+        <w:tab/>
+      </w:r>
+      <w:r>
+        <w:tab/>
+      </w:r>
+      <w:r>
+        <w:tab/>
+      </w:r>
+      <w:r>
+        <w:tab/>
+      </w:r>
+      <w:r>
+        <w:tab/>
+      </w:r>
+      <w:r>
+        <w:tab/>
+      </w:r>
+      <w:r>
+        <w:tab/>
+      </w:r>
+      <w:r>
+        <w:tab/>
+      </w:r>
+      <w:r>
+        <w:tab/>
+      </w:r>
+      <w:r>
+        <w:tab/>
+      </w:r>
+      <w:r>
+        <w:tab/>
+      </w:r>
+      <w:r>
+        <w:tab/>
+      </w:r>
+      <w:r>
+        <w:tab/>
+      </w:r>
+      <w:r>
+        <w:tab/>
+      </w:r>
+      <w:r>
+        <w:tab/>
+      </w:r>
+      <w:r>
+        <w:tab/>
+      </w:r>
+      <w:r>
+        <w:tab/>
+      </w:r>
+      <w:r>
+        <w:tab/>
+      </w:r>
+      <w:r>
+        <w:tab/>
+      </w:r>
+      <w:r>
+        <w:tab/>
+      </w:r>
+      <w:r>
+        <w:tab/>
+      </w:r>
+      <w:r>
+        <w:tab/>
+      </w:r>
+      <w:r>
+        <w:tab/>
+      </w:r>
+      <w:r>
+        <w:tab/>
+      </w:r>
+      <w:r>
+        <w:tab/>
+      </w:r>
+      <w:r>
+        <w:tab/>
+      </w:r>
+      <w:r>
+        <w:tab/>
+      </w:r>
+      <w:r>
+        <w:tab/>
+      </w:r>
+      <w:r>
+        <w:tab/>
+      </w:r>
+      <w:r>
+        <w:tab/>
+      </w:r>
+      <w:r>
+        <w:tab/>
+      </w:r>
+      <w:r>
+        <w:tab/>
+      </w:r>
+      <w:r>
+        <w:tab/>
+      </w:r>
+      <w:r>
+        <w:tab/>
+      </w:r>
+      <w:r>
+        <w:tab/>
+      </w:r>
+      <w:r>
+        <w:tab/>
+      </w:r>
+      <w:r>
+        <w:tab/>
+      </w:r>
+      <w:r>
+        <w:tab/>
+      </w:r>
+      <w:r>
+        <w:tab/>
+      </w:r>
+      <w:r>
+        <w:tab/>
+      </w:r>
+      <w:r>
+        <w:tab/>
+      </w:r>
+      <w:r>
+        <w:tab/>
+      </w:r>
+      <w:r>
+        <w:tab/>
+      </w:r>
+      <w:r>
+        <w:tab/>
+      </w:r>
+      <w:r>
+        <w:tab/>
+      </w:r>
+      <w:r>
+        <w:tab/>
+      </w:r>
+      <w:r>
+        <w:tab/>
+      </w:r>
+      <w:r>
+        <w:tab/>
+      </w:r>
+      <w:r>
+        <w:tab/>
+      </w:r>
+      <w:r>
+        <w:tab/>
+      </w:r>
+      <w:r>
+        <w:tab/>
+      </w:r>
+      <w:r>
+        <w:tab/>
+      </w:r>
+      <w:r>
+        <w:tab/>
+      </w:r>
+      <w:r>
+        <w:tab/>
+      </w:r>
+      <w:r>
+        <w:tab/>
+      </w:r>
+      <w:r>
+        <w:tab/>
+      </w:r>
+      <w:r>
+        <w:tab/>
+      </w:r>
+      <w:r>
+        <w:tab/>
+      </w:r>
+      <w:r>
+        <w:tab/>
+      </w:r>
+      <w:r>
+        <w:tab/>
+      </w:r>
+      <w:r>
+        <w:tab/>
+      </w:r>
+      <w:r>
+        <w:tab/>
+      </w:r>
+      <w:r>
+        <w:tab/>
+      </w:r>
+      <w:r>
+        <w:tab/>
+      </w:r>
+      <w:r>
+        <w:tab/>
+      </w:r>
+      <w:r>
+        <w:tab/>
+      </w:r>
+      <w:r>
+        <w:tab/>
+      </w:r>
+      <w:r>
+        <w:tab/>
+      </w:r>
+      <w:r>
+        <w:tab/>
+      </w:r>
+      <w:r>
+        <w:tab/>
+      </w:r>
+      <w:r>
+        <w:tab/>
+      </w:r>
+      <w:r>
+        <w:tab/>
+      </w:r>
+      <w:r>
+        <w:tab/>
+      </w:r>
+      <w:r>
+        <w:tab/>
+      </w:r>
+      <w:r>
+        <w:tab/>
+      </w:r>
+      <w:r>
+        <w:tab/>
+      </w:r>
+      <w:r>
+        <w:tab/>
+      </w:r>
+      <w:r>
+        <w:tab/>
+      </w:r>
+      <w:r>
+        <w:tab/>
+      </w:r>
+      <w:r>
+        <w:tab/>
+      </w:r>
+      <w:r>
+        <w:tab/>
+      </w:r>
+      <w:r>
+        <w:tab/>
+      </w:r>
+      <w:r>
+        <w:tab/>
+      </w:r>
+      <w:r>
+        <w:tab/>
+      </w:r>
+      <w:r>
+        <w:tab/>
+      </w:r>
+      <w:r>
+        <w:tab/>
+      </w:r>
+      <w:r>
+        <w:tab/>
+      </w:r>
+      <w:r>
+        <w:tab/>
+      </w:r>
+      <w:r>
+        <w:tab/>
+      </w:r>
+      <w:r>
+        <w:tab/>
+      </w:r>
+      <w:r>
+        <w:tab/>
+      </w:r>
+      <w:r>
+        <w:tab/>
+      </w:r>
+      <w:r>
+        <w:tab/>
+      </w:r>
+      <w:r>
+        <w:tab/>
+      </w:r>
+      <w:r>
+        <w:tab/>
+      </w:r>
+      <w:r>
+        <w:tab/>
+      </w:r>
+      <w:r>
+        <w:tab/>
+      </w:r>
+      <w:r>
+        <w:tab/>
+      </w:r>
+      <w:r>
+        <w:tab/>
+      </w:r>
+      <w:r>
+        <w:tab/>
+      </w:r>
+      <w:r>
+        <w:tab/>
+      </w:r>
+      <w:r>
+        <w:tab/>
+      </w:r>
+      <w:r>
+        <w:tab/>
+      </w:r>
+      <w:r>
+        <w:tab/>
+      </w:r>
+      <w:r>
+        <w:tab/>
+      </w:r>
+      <w:r>
+        <w:tab/>
+      </w:r>
+      <w:r>
+        <w:tab/>
+      </w:r>
+      <w:r>
+        <w:tab/>
+      </w:r>
+      <w:r>
+        <w:tab/>
+      </w:r>
+      <w:r>
+        <w:tab/>
+      </w:r>
+      <w:r>
+        <w:tab/>
+      </w:r>
+      <w:r>
+        <w:tab/>
+      </w:r>
+      <w:r>
+        <w:tab/>
+      </w:r>
+      <w:r>
+        <w:tab/>
+      </w:r>
+      <w:r>
+        <w:tab/>
+      </w:r>
+      <w:r>
+        <w:tab/>
+      </w:r>
+      <w:r>
+        <w:tab/>
+      </w:r>
+      <w:r>
+        <w:tab/>
+      </w:r>
+      <w:r>
+        <w:tab/>
+      </w:r>
+      <w:r>
+        <w:tab/>
+      </w:r>
+      <w:r>
+        <w:tab/>
+      </w:r>
+      <w:r>
+        <w:tab/>
+      </w:r>
+      <w:r>
+        <w:tab/>
+      </w:r>
+      <w:r>
+        <w:tab/>
+      </w:r>
+      <w:r>
+        <w:tab/>
+      </w:r>
+      <w:r>
+        <w:tab/>
+      </w:r>
+      <w:r>
+        <w:tab/>
+      </w:r>
+      <w:r>
+        <w:tab/>
+      </w:r>
+      <w:r>
+        <w:tab/>
+      </w:r>
+      <w:r>
+        <w:tab/>
+      </w:r>
+      <w:r>
+        <w:tab/>
+      </w:r>
+      <w:r>
+        <w:tab/>
+      </w:r>
+      <w:r>
+        <w:tab/>
+      </w:r>
+      <w:r>
+        <w:tab/>
+      </w:r>
+      <w:r>
+        <w:tab/>
+      </w:r>
+      <w:r>
+        <w:tab/>
+      </w:r>
+      <w:r>
+        <w:tab/>
+      </w:r>
+      <w:r>
+        <w:tab/>
+      </w:r>
+      <w:r>
+        <w:tab/>
+      </w:r>
+      <w:r>
+        <w:tab/>
+      </w:r>
+      <w:r>
+        <w:tab/>
+      </w:r>
+      <w:r>
+        <w:tab/>
+      </w:r>
+      <w:r>
+        <w:tab/>
+      </w:r>
+      <w:r>
+        <w:tab/>
+      </w:r>
+      <w:r>
+        <w:tab/>
+      </w:r>
+      <w:r>
+        <w:tab/>
+      </w:r>
+      <w:r>
+        <w:tab/>
+      </w:r>
+      <w:r>
+        <w:tab/>
+      </w:r>
+      <w:r>
+        <w:tab/>
+      </w:r>
+      <w:r>
+        <w:tab/>
+      </w:r>
+      <w:r>
+        <w:tab/>
+      </w:r>
+      <w:r>
+        <w:tab/>
+      </w:r>
+      <w:r>
+        <w:tab/>
+      </w:r>
+      <w:r>
+        <w:tab/>
+      </w:r>
+      <w:r>
+        <w:tab/>
+      </w:r>
+      <w:r>
+        <w:tab/>
+      </w:r>
+      <w:r>
+        <w:tab/>
+      </w:r>
+      <w:r>
+        <w:tab/>
+      </w:r>
+      <w:r>
+        <w:tab/>
+      </w:r>
+      <w:r>
+        <w:tab/>
+      </w:r>
+      <w:r>
+        <w:tab/>
+      </w:r>
+      <w:r>
+        <w:tab/>
+      </w:r>
+      <w:r>
+        <w:tab/>
+      </w:r>
+      <w:r>
+        <w:tab/>
+      </w:r>
+      <w:r>
+        <w:tab/>
+      </w:r>
+      <w:r>
+        <w:tab/>
+      </w:r>
+      <w:r>
+        <w:tab/>
+      </w:r>
+      <w:r>
+        <w:tab/>
+      </w:r>
+      <w:r>
+        <w:tab/>
+      </w:r>
+      <w:r>
+        <w:tab/>
+      </w:r>
+      <w:r>
+        <w:tab/>
+      </w:r>
+      <w:r>
+        <w:tab/>
+      </w:r>
+      <w:r>
+        <w:tab/>
+      </w:r>
+      <w:r>
+        <w:tab/>
+      </w:r>
+      <w:r>
+        <w:tab/>
+      </w:r>
+      <w:r>
+        <w:tab/>
+      </w:r>
+      <w:r>
+        <w:tab/>
+      </w:r>
+      <w:r>
+        <w:tab/>
+      </w:r>
+      <w:r>
+        <w:tab/>
+      </w:r>
+      <w:r>
+        <w:tab/>
+      </w:r>
+      <w:r>
+        <w:tab/>
+      </w:r>
+      <w:r>
+        <w:tab/>
+      </w:r>
+      <w:r>
+        <w:tab/>
+      </w:r>
+      <w:r>
+        <w:tab/>
+      </w:r>
+      <w:r>
+        <w:tab/>
+      </w:r>
+      <w:r>
+        <w:tab/>
+      </w:r>
+      <w:r>
+        <w:tab/>
+      </w:r>
+      <w:r>
+        <w:tab/>
+      </w:r>
+      <w:r>
+        <w:tab/>
+      </w:r>
+      <w:r>
+        <w:tab/>
+      </w:r>
+      <w:r>
+        <w:tab/>
+      </w:r>
+      <w:r>
+        <w:tab/>
+      </w:r>
+      <w:r>
+        <w:tab/>
+      </w:r>
+      <w:r>
+        <w:tab/>
+      </w:r>
+      <w:r>
+        <w:tab/>
+      </w:r>
+      <w:r>
+        <w:tab/>
+      </w:r>
+      <w:r>
+        <w:tab/>
+      </w:r>
+      <w:r>
+        <w:tab/>
+      </w:r>
+      <w:r>
+        <w:tab/>
+      </w:r>
+      <w:r>
+        <w:tab/>
+      </w:r>
+      <w:r>
+        <w:tab/>
+      </w:r>
+      <w:r>
+        <w:tab/>
+      </w:r>
+      <w:r>
+        <w:tab/>
+      </w:r>
+      <w:r>
+        <w:tab/>
+      </w:r>
+      <w:r>
+        <w:tab/>
+      </w:r>
+      <w:r>
+        <w:tab/>
+      </w:r>
+      <w:r>
+        <w:tab/>
+      </w:r>
+      <w:r>
+        <w:tab/>
+      </w:r>
+      <w:r>
+        <w:tab/>
+      </w:r>
+      <w:r>
+        <w:tab/>
+      </w:r>
+      <w:r>
+        <w:tab/>
+      </w:r>
+      <w:r>
+        <w:tab/>
+      </w:r>
+      <w:r>
+        <w:tab/>
+      </w:r>
+      <w:r>
+        <w:tab/>
+      </w:r>
+      <w:r>
+        <w:tab/>
+      </w:r>
+      <w:r>
+        <w:tab/>
+      </w:r>
+      <w:r>
+        <w:tab/>
+      </w:r>
+      <w:r>
+        <w:tab/>
+      </w:r>
+      <w:r>
+        <w:tab/>
+      </w:r>
+      <w:r>
+        <w:lastRenderedPageBreak/>
+        <w:tab/>
+      </w:r>
+      <w:r>
+        <w:tab/>
+      </w:r>
+      <w:r>
+        <w:tab/>
+      </w:r>
+      <w:r>
+        <w:tab/>
+      </w:r>
+      <w:r>
+        <w:tab/>
+      </w:r>
+      <w:r>
+        <w:tab/>
+      </w:r>
+      <w:r>
+        <w:tab/>
+      </w:r>
+      <w:r>
+        <w:tab/>
+      </w:r>
+      <w:r>
+        <w:tab/>
+      </w:r>
+      <w:r>
+        <w:tab/>
+      </w:r>
+      <w:r>
+        <w:tab/>
+      </w:r>
+      <w:r>
+        <w:tab/>
+      </w:r>
+      <w:r>
+        <w:tab/>
+      </w:r>
+      <w:r>
+        <w:tab/>
+      </w:r>
+      <w:r>
+        <w:tab/>
+      </w:r>
+      <w:r>
+        <w:tab/>
+      </w:r>
+      <w:r>
+        <w:tab/>
+      </w:r>
+      <w:r>
+        <w:tab/>
+      </w:r>
+      <w:r>
+        <w:tab/>
+      </w:r>
+      <w:r>
+        <w:tab/>
+      </w:r>
+      <w:r>
+        <w:tab/>
+      </w:r>
+      <w:r>
+        <w:tab/>
+      </w:r>
+      <w:r>
+        <w:tab/>
+      </w:r>
+      <w:r>
+        <w:tab/>
+      </w:r>
+      <w:r>
+        <w:tab/>
+      </w:r>
+      <w:r>
+        <w:tab/>
+      </w:r>
+      <w:r>
+        <w:tab/>
+      </w:r>
+      <w:r>
+        <w:tab/>
+      </w:r>
+      <w:r>
+        <w:tab/>
+      </w:r>
+      <w:r>
+        <w:tab/>
+      </w:r>
+      <w:r>
+        <w:tab/>
+      </w:r>
+      <w:r>
+        <w:tab/>
+      </w:r>
+      <w:r>
+        <w:tab/>
+      </w:r>
+      <w:r>
+        <w:tab/>
+      </w:r>
+      <w:r>
+        <w:tab/>
+      </w:r>
+      <w:r>
+        <w:tab/>
+      </w:r>
+      <w:r>
+        <w:tab/>
+      </w:r>
+      <w:r>
+        <w:tab/>
+      </w:r>
+      <w:r>
+        <w:tab/>
+      </w:r>
+      <w:r>
+        <w:tab/>
+      </w:r>
+      <w:r>
+        <w:tab/>
+      </w:r>
+      <w:r>
+        <w:tab/>
+      </w:r>
+      <w:r>
+        <w:tab/>
+      </w:r>
+      <w:r>
+        <w:tab/>
+      </w:r>
+      <w:r>
+        <w:tab/>
+      </w:r>
+      <w:r>
+        <w:tab/>
+      </w:r>
+      <w:r>
+        <w:tab/>
+      </w:r>
+      <w:r>
+        <w:tab/>
+      </w:r>
+      <w:r>
+        <w:tab/>
+      </w:r>
+      <w:r>
+        <w:tab/>
+      </w:r>
+      <w:r>
+        <w:tab/>
+      </w:r>
+      <w:r>
+        <w:tab/>
+      </w:r>
+      <w:r>
+        <w:tab/>
+      </w:r>
+      <w:r>
+        <w:tab/>
+      </w:r>
+      <w:r>
+        <w:tab/>
+      </w:r>
+      <w:r>
+        <w:tab/>
+      </w:r>
+      <w:r>
+        <w:tab/>
+      </w:r>
+      <w:r>
+        <w:tab/>
+      </w:r>
+      <w:r>
+        <w:tab/>
+      </w:r>
+      <w:r>
+        <w:tab/>
+      </w:r>
+      <w:r>
+        <w:tab/>
+      </w:r>
+      <w:r>
+        <w:tab/>
+      </w:r>
+      <w:r>
+        <w:tab/>
+      </w:r>
+      <w:r>
+        <w:tab/>
+      </w:r>
+      <w:r>
+        <w:tab/>
+      </w:r>
+      <w:r>
+        <w:tab/>
+      </w:r>
+      <w:r>
+        <w:tab/>
+      </w:r>
+      <w:r>
+        <w:tab/>
+      </w:r>
+      <w:r>
+        <w:tab/>
+      </w:r>
+      <w:r>
+        <w:tab/>
+      </w:r>
+      <w:r>
+        <w:tab/>
+      </w:r>
+      <w:r>
+        <w:tab/>
+      </w:r>
+      <w:r>
+        <w:tab/>
+      </w:r>
+      <w:r>
+        <w:tab/>
+      </w:r>
+      <w:r>
+        <w:tab/>
+      </w:r>
+      <w:r>
+        <w:tab/>
+      </w:r>
+      <w:r>
+        <w:tab/>
+      </w:r>
+      <w:r>
+        <w:tab/>
+      </w:r>
+      <w:r>
+        <w:tab/>
+      </w:r>
+      <w:r>
+        <w:tab/>
+      </w:r>
+      <w:r>
+        <w:tab/>
+      </w:r>
+      <w:r>
+        <w:tab/>
+      </w:r>
+      <w:r>
+        <w:tab/>
+      </w:r>
+      <w:r>
+        <w:tab/>
+      </w:r>
+      <w:r>
+        <w:tab/>
+      </w:r>
+      <w:r>
+        <w:tab/>
+      </w:r>
+      <w:r>
+        <w:tab/>
+      </w:r>
+      <w:r>
+        <w:tab/>
+      </w:r>
+      <w:r>
+        <w:tab/>
+      </w:r>
+      <w:r>
+        <w:tab/>
+      </w:r>
+      <w:r>
+        <w:tab/>
+      </w:r>
+      <w:r>
+        <w:tab/>
+      </w:r>
+      <w:r>
+        <w:tab/>
+      </w:r>
+      <w:r>
+        <w:tab/>
+      </w:r>
+      <w:r>
+        <w:tab/>
+      </w:r>
+      <w:r>
+        <w:tab/>
+      </w:r>
+      <w:r>
+        <w:tab/>
+      </w:r>
+      <w:r>
+        <w:tab/>
+      </w:r>
+      <w:r>
+        <w:tab/>
+      </w:r>
+      <w:r>
+        <w:tab/>
+      </w:r>
+      <w:r>
+        <w:tab/>
+      </w:r>
+      <w:r>
+        <w:tab/>
+      </w:r>
+      <w:r>
+        <w:tab/>
+      </w:r>
+      <w:r>
+        <w:tab/>
+      </w:r>
+      <w:r>
+        <w:tab/>
+      </w:r>
+      <w:r>
+        <w:tab/>
+      </w:r>
+      <w:r>
+        <w:tab/>
+      </w:r>
+      <w:r>
+        <w:tab/>
+      </w:r>
+      <w:r>
+        <w:tab/>
+      </w:r>
+      <w:r>
+        <w:tab/>
+      </w:r>
+      <w:r>
+        <w:tab/>
+      </w:r>
+      <w:r>
+        <w:tab/>
+      </w:r>
+      <w:r>
+        <w:tab/>
+      </w:r>
+      <w:r>
+        <w:tab/>
+      </w:r>
+      <w:r>
+        <w:tab/>
+      </w:r>
+      <w:r>
+        <w:tab/>
+      </w:r>
+      <w:r>
+        <w:tab/>
+      </w:r>
+      <w:r>
+        <w:tab/>
+      </w:r>
+      <w:r>
+        <w:tab/>
+      </w:r>
+      <w:r>
+        <w:tab/>
+      </w:r>
+      <w:r>
+        <w:tab/>
+      </w:r>
+      <w:r>
+        <w:tab/>
+      </w:r>
+      <w:r>
+        <w:tab/>
+      </w:r>
+      <w:r>
+        <w:tab/>
+      </w:r>
+      <w:r>
+        <w:tab/>
+      </w:r>
+      <w:r>
+        <w:tab/>
+      </w:r>
+      <w:r>
+        <w:tab/>
+      </w:r>
+      <w:r>
+        <w:tab/>
+      </w:r>
+      <w:r>
+        <w:tab/>
+      </w:r>
+      <w:r>
+        <w:tab/>
+      </w:r>
+      <w:r>
+        <w:tab/>
+      </w:r>
+      <w:r>
+        <w:tab/>
+      </w:r>
+      <w:r>
+        <w:tab/>
+      </w:r>
+      <w:r>
+        <w:tab/>
+      </w:r>
+      <w:r>
+        <w:tab/>
+      </w:r>
+      <w:r>
+        <w:tab/>
+      </w:r>
+      <w:r>
+        <w:tab/>
+      </w:r>
+      <w:r>
+        <w:tab/>
+      </w:r>
+      <w:r>
+        <w:tab/>
+      </w:r>
+      <w:r>
+        <w:tab/>
+      </w:r>
+      <w:r>
+        <w:tab/>
+      </w:r>
+      <w:r>
+        <w:tab/>
+      </w:r>
+      <w:r>
+        <w:tab/>
+      </w:r>
+      <w:r>
+        <w:tab/>
+      </w:r>
+      <w:r>
+        <w:tab/>
+      </w:r>
+      <w:r>
+        <w:tab/>
+      </w:r>
+      <w:r>
+        <w:tab/>
+      </w:r>
+      <w:r>
+        <w:tab/>
+      </w:r>
+      <w:r>
+        <w:tab/>
+      </w:r>
+      <w:r>
+        <w:tab/>
+      </w:r>
+      <w:r>
+        <w:tab/>
+      </w:r>
+      <w:r>
+        <w:tab/>
+      </w:r>
+      <w:r>
+        <w:tab/>
+      </w:r>
+      <w:r>
+        <w:tab/>
+      </w:r>
+      <w:r>
+        <w:tab/>
+      </w:r>
+      <w:r>
+        <w:tab/>
+      </w:r>
+      <w:r>
+        <w:tab/>
+      </w:r>
+      <w:r>
+        <w:tab/>
+      </w:r>
+      <w:r>
+        <w:tab/>
+      </w:r>
+      <w:r>
+        <w:tab/>
+      </w:r>
+      <w:r>
+        <w:tab/>
+      </w:r>
+      <w:r>
+        <w:tab/>
+      </w:r>
+      <w:r>
+        <w:tab/>
+      </w:r>
+      <w:r>
+        <w:tab/>
+      </w:r>
+      <w:r>
+        <w:tab/>
+      </w:r>
+      <w:r>
+        <w:tab/>
+      </w:r>
+      <w:r>
+        <w:tab/>
+      </w:r>
+      <w:r>
+        <w:tab/>
+      </w:r>
+      <w:r>
+        <w:tab/>
+      </w:r>
+      <w:r>
+        <w:tab/>
+      </w:r>
+      <w:r>
+        <w:tab/>
+      </w:r>
+      <w:r>
+        <w:tab/>
+      </w:r>
+      <w:r>
+        <w:tab/>
+      </w:r>
+      <w:r>
+        <w:tab/>
+      </w:r>
+      <w:r>
+        <w:tab/>
+      </w:r>
+      <w:r>
+        <w:tab/>
+      </w:r>
+      <w:r>
+        <w:tab/>
+      </w:r>
+      <w:r>
+        <w:tab/>
+      </w:r>
+      <w:r>
+        <w:tab/>
+      </w:r>
+      <w:r>
+        <w:tab/>
+      </w:r>
+      <w:r>
+        <w:tab/>
+      </w:r>
+      <w:r>
+        <w:tab/>
+      </w:r>
+      <w:r>
+        <w:tab/>
+      </w:r>
+      <w:r>
+        <w:tab/>
+      </w:r>
+      <w:r>
+        <w:tab/>
+      </w:r>
+      <w:r>
+        <w:tab/>
+      </w:r>
+      <w:r>
+        <w:tab/>
+      </w:r>
+      <w:r>
+        <w:tab/>
+      </w:r>
+      <w:r>
+        <w:tab/>
+      </w:r>
+      <w:r>
+        <w:tab/>
+      </w:r>
+      <w:r>
+        <w:tab/>
+      </w:r>
+      <w:r>
+        <w:tab/>
+      </w:r>
+      <w:r>
+        <w:tab/>
+      </w:r>
+      <w:r>
+        <w:tab/>
+      </w:r>
+      <w:r>
+        <w:tab/>
+      </w:r>
+      <w:r>
+        <w:tab/>
+      </w:r>
+      <w:r>
+        <w:tab/>
+      </w:r>
+      <w:r>
+        <w:tab/>
+      </w:r>
+      <w:r>
+        <w:tab/>
+      </w:r>
+      <w:r>
+        <w:tab/>
+      </w:r>
+      <w:r>
+        <w:tab/>
+      </w:r>
+      <w:r>
+        <w:tab/>
+      </w:r>
+      <w:r>
+        <w:tab/>
+      </w:r>
+      <w:r>
+        <w:tab/>
+      </w:r>
+      <w:r>
+        <w:tab/>
+      </w:r>
+      <w:r>
+        <w:tab/>
+      </w:r>
+      <w:r>
+        <w:tab/>
+      </w:r>
+      <w:r>
+        <w:tab/>
+      </w:r>
+      <w:r>
+        <w:tab/>
+      </w:r>
+      <w:r>
+        <w:tab/>
+      </w:r>
+      <w:r>
+        <w:tab/>
+      </w:r>
+      <w:r>
+        <w:tab/>
       </w:r>
     </w:p>
     <w:p>
@@ -212,7 +1765,6 @@
         <w:br/>
       </w:r>
       <w:hyperlink r:id="rId5">
-        <w:proofErr w:type="spellStart"/>
         <w:r>
           <w:rPr>
             <w:b/>
@@ -220,19 +1772,8 @@
             <w:color w:val="1155CC"/>
             <w:u w:val="single"/>
           </w:rPr>
-          <w:t>Nursing_Data</w:t>
+          <w:t>Nursin</w:t>
         </w:r>
-        <w:proofErr w:type="spellEnd"/>
-      </w:hyperlink>
-      <w:r>
-        <w:rPr>
-          <w:b/>
-          <w:bCs/>
-        </w:rPr>
-        <w:t xml:space="preserve">  </w:t>
-      </w:r>
-      <w:hyperlink r:id="rId6">
-        <w:proofErr w:type="spellStart"/>
         <w:r>
           <w:rPr>
             <w:b/>
@@ -240,9 +1781,8 @@
             <w:color w:val="1155CC"/>
             <w:u w:val="single"/>
           </w:rPr>
-          <w:t>Supporting_CSV</w:t>
+          <w:t>g</w:t>
         </w:r>
-        <w:proofErr w:type="spellEnd"/>
         <w:r>
           <w:rPr>
             <w:b/>
@@ -250,7 +1790,43 @@
             <w:color w:val="1155CC"/>
             <w:u w:val="single"/>
           </w:rPr>
-          <w:t xml:space="preserve"> </w:t>
+          <w:t>_Data</w:t>
+        </w:r>
+      </w:hyperlink>
+      <w:r>
+        <w:rPr>
+          <w:b/>
+          <w:bCs/>
+        </w:rPr>
+        <w:t xml:space="preserve">  </w:t>
+      </w:r>
+      <w:hyperlink r:id="rId6">
+        <w:r>
+          <w:rPr>
+            <w:b/>
+            <w:bCs/>
+            <w:color w:val="1155CC"/>
+            <w:u w:val="single"/>
+          </w:rPr>
+          <w:t>Supp</w:t>
+        </w:r>
+        <w:r>
+          <w:rPr>
+            <w:b/>
+            <w:bCs/>
+            <w:color w:val="1155CC"/>
+            <w:u w:val="single"/>
+          </w:rPr>
+          <w:t>o</w:t>
+        </w:r>
+        <w:r>
+          <w:rPr>
+            <w:b/>
+            <w:bCs/>
+            <w:color w:val="1155CC"/>
+            <w:u w:val="single"/>
+          </w:rPr>
+          <w:t xml:space="preserve">rting_CSV </w:t>
         </w:r>
       </w:hyperlink>
     </w:p>
@@ -276,7 +1852,7 @@
     </w:p>
     <w:tbl>
       <w:tblPr>
-        <w:tblStyle w:val="a"/>
+        <w:tblStyle w:val="1"/>
         <w:tblW w:w="8640" w:type="dxa"/>
         <w:tblInd w:w="0" w:type="dxa"/>
         <w:tblBorders>
@@ -1153,7 +2729,6 @@
                 <w:szCs w:val="18"/>
               </w:rPr>
             </w:pPr>
-            <w:proofErr w:type="spellStart"/>
             <w:r>
               <w:rPr>
                 <w:color w:val="3C4043"/>
@@ -1162,7 +2737,6 @@
               </w:rPr>
               <w:t>CY_Qtr</w:t>
             </w:r>
-            <w:proofErr w:type="spellEnd"/>
           </w:p>
         </w:tc>
         <w:tc>
@@ -1268,7 +2842,6 @@
                 <w:szCs w:val="18"/>
               </w:rPr>
             </w:pPr>
-            <w:proofErr w:type="spellStart"/>
             <w:r>
               <w:rPr>
                 <w:color w:val="3C4043"/>
@@ -1277,7 +2850,6 @@
               </w:rPr>
               <w:t>WorkDate</w:t>
             </w:r>
-            <w:proofErr w:type="spellEnd"/>
           </w:p>
         </w:tc>
         <w:tc>
@@ -1383,7 +2955,6 @@
                 <w:szCs w:val="18"/>
               </w:rPr>
             </w:pPr>
-            <w:proofErr w:type="spellStart"/>
             <w:r>
               <w:rPr>
                 <w:color w:val="3C4043"/>
@@ -1392,7 +2963,6 @@
               </w:rPr>
               <w:t>MDScensus</w:t>
             </w:r>
-            <w:proofErr w:type="spellEnd"/>
           </w:p>
         </w:tc>
         <w:tc>
@@ -1498,7 +3068,6 @@
                 <w:szCs w:val="18"/>
               </w:rPr>
             </w:pPr>
-            <w:proofErr w:type="spellStart"/>
             <w:r>
               <w:rPr>
                 <w:color w:val="3C4043"/>
@@ -1507,7 +3076,6 @@
               </w:rPr>
               <w:t>Hrs_RNDON</w:t>
             </w:r>
-            <w:proofErr w:type="spellEnd"/>
           </w:p>
         </w:tc>
         <w:tc>
@@ -1613,7 +3181,6 @@
                 <w:szCs w:val="18"/>
               </w:rPr>
             </w:pPr>
-            <w:proofErr w:type="spellStart"/>
             <w:r>
               <w:rPr>
                 <w:color w:val="3C4043"/>
@@ -1622,7 +3189,6 @@
               </w:rPr>
               <w:t>Hrs_RNDON_emp</w:t>
             </w:r>
-            <w:proofErr w:type="spellEnd"/>
           </w:p>
         </w:tc>
         <w:tc>
@@ -1728,7 +3294,6 @@
                 <w:szCs w:val="18"/>
               </w:rPr>
             </w:pPr>
-            <w:proofErr w:type="spellStart"/>
             <w:r>
               <w:rPr>
                 <w:color w:val="3C4043"/>
@@ -1737,7 +3302,6 @@
               </w:rPr>
               <w:t>Hrs_RNDON_ctr</w:t>
             </w:r>
-            <w:proofErr w:type="spellEnd"/>
           </w:p>
         </w:tc>
         <w:tc>
@@ -1843,7 +3407,6 @@
                 <w:szCs w:val="18"/>
               </w:rPr>
             </w:pPr>
-            <w:proofErr w:type="spellStart"/>
             <w:r>
               <w:rPr>
                 <w:color w:val="3C4043"/>
@@ -1852,7 +3415,6 @@
               </w:rPr>
               <w:t>Hrs_RNadmin</w:t>
             </w:r>
-            <w:proofErr w:type="spellEnd"/>
           </w:p>
         </w:tc>
         <w:tc>
@@ -1958,7 +3520,6 @@
                 <w:szCs w:val="18"/>
               </w:rPr>
             </w:pPr>
-            <w:proofErr w:type="spellStart"/>
             <w:r>
               <w:rPr>
                 <w:color w:val="3C4043"/>
@@ -1967,7 +3528,6 @@
               </w:rPr>
               <w:t>Hrs_RNadmin_emp</w:t>
             </w:r>
-            <w:proofErr w:type="spellEnd"/>
           </w:p>
         </w:tc>
         <w:tc>
@@ -2074,7 +3634,6 @@
                 <w:szCs w:val="18"/>
               </w:rPr>
             </w:pPr>
-            <w:proofErr w:type="spellStart"/>
             <w:r>
               <w:rPr>
                 <w:color w:val="3C4043"/>
@@ -2083,7 +3642,6 @@
               </w:rPr>
               <w:t>Hrs_RNadmin_ctr</w:t>
             </w:r>
-            <w:proofErr w:type="spellEnd"/>
           </w:p>
         </w:tc>
         <w:tc>
@@ -2189,7 +3747,6 @@
                 <w:szCs w:val="18"/>
               </w:rPr>
             </w:pPr>
-            <w:proofErr w:type="spellStart"/>
             <w:r>
               <w:rPr>
                 <w:color w:val="3C4043"/>
@@ -2198,7 +3755,6 @@
               </w:rPr>
               <w:t>Hrs_RN</w:t>
             </w:r>
-            <w:proofErr w:type="spellEnd"/>
           </w:p>
         </w:tc>
         <w:tc>
@@ -2304,7 +3860,6 @@
                 <w:szCs w:val="18"/>
               </w:rPr>
             </w:pPr>
-            <w:proofErr w:type="spellStart"/>
             <w:r>
               <w:rPr>
                 <w:color w:val="3C4043"/>
@@ -2313,7 +3868,6 @@
               </w:rPr>
               <w:t>Hrs_RN_emp</w:t>
             </w:r>
-            <w:proofErr w:type="spellEnd"/>
           </w:p>
         </w:tc>
         <w:tc>
@@ -2532,7 +4086,6 @@
                 <w:szCs w:val="18"/>
               </w:rPr>
             </w:pPr>
-            <w:proofErr w:type="spellStart"/>
             <w:r>
               <w:rPr>
                 <w:color w:val="3C4043"/>
@@ -2541,7 +4094,6 @@
               </w:rPr>
               <w:t>Hrs_LPNadmin</w:t>
             </w:r>
-            <w:proofErr w:type="spellEnd"/>
           </w:p>
         </w:tc>
         <w:tc>
@@ -2647,7 +4199,6 @@
                 <w:szCs w:val="18"/>
               </w:rPr>
             </w:pPr>
-            <w:proofErr w:type="spellStart"/>
             <w:r>
               <w:rPr>
                 <w:color w:val="3C4043"/>
@@ -2656,7 +4207,6 @@
               </w:rPr>
               <w:t>Hrs_LPNadmin_emp</w:t>
             </w:r>
-            <w:proofErr w:type="spellEnd"/>
           </w:p>
         </w:tc>
         <w:tc>
@@ -2762,7 +4312,6 @@
                 <w:szCs w:val="18"/>
               </w:rPr>
             </w:pPr>
-            <w:proofErr w:type="spellStart"/>
             <w:r>
               <w:rPr>
                 <w:color w:val="3C4043"/>
@@ -2771,7 +4320,6 @@
               </w:rPr>
               <w:t>Hrs_LPNadmin_ctr</w:t>
             </w:r>
-            <w:proofErr w:type="spellEnd"/>
           </w:p>
         </w:tc>
         <w:tc>
@@ -2877,7 +4425,6 @@
                 <w:szCs w:val="18"/>
               </w:rPr>
             </w:pPr>
-            <w:proofErr w:type="spellStart"/>
             <w:r>
               <w:rPr>
                 <w:color w:val="3C4043"/>
@@ -2886,7 +4433,6 @@
               </w:rPr>
               <w:t>Hrs_LPN</w:t>
             </w:r>
-            <w:proofErr w:type="spellEnd"/>
           </w:p>
         </w:tc>
         <w:tc>
@@ -2992,7 +4538,6 @@
                 <w:szCs w:val="18"/>
               </w:rPr>
             </w:pPr>
-            <w:proofErr w:type="spellStart"/>
             <w:r>
               <w:rPr>
                 <w:color w:val="3C4043"/>
@@ -3001,7 +4546,6 @@
               </w:rPr>
               <w:t>Hrs_LPN_emp</w:t>
             </w:r>
-            <w:proofErr w:type="spellEnd"/>
           </w:p>
         </w:tc>
         <w:tc>
@@ -3107,7 +4651,6 @@
                 <w:szCs w:val="18"/>
               </w:rPr>
             </w:pPr>
-            <w:proofErr w:type="spellStart"/>
             <w:r>
               <w:rPr>
                 <w:color w:val="3C4043"/>
@@ -3116,7 +4659,6 @@
               </w:rPr>
               <w:t>Hrs_LPN_ctr</w:t>
             </w:r>
-            <w:proofErr w:type="spellEnd"/>
           </w:p>
         </w:tc>
         <w:tc>
@@ -3222,7 +4764,6 @@
                 <w:szCs w:val="18"/>
               </w:rPr>
             </w:pPr>
-            <w:proofErr w:type="spellStart"/>
             <w:r>
               <w:rPr>
                 <w:color w:val="3C4043"/>
@@ -3231,7 +4772,6 @@
               </w:rPr>
               <w:t>Hrs_CNA</w:t>
             </w:r>
-            <w:proofErr w:type="spellEnd"/>
           </w:p>
         </w:tc>
         <w:tc>
@@ -3337,7 +4877,6 @@
                 <w:szCs w:val="18"/>
               </w:rPr>
             </w:pPr>
-            <w:proofErr w:type="spellStart"/>
             <w:r>
               <w:rPr>
                 <w:color w:val="3C4043"/>
@@ -3346,7 +4885,6 @@
               </w:rPr>
               <w:t>Hrs_CNA_emp</w:t>
             </w:r>
-            <w:proofErr w:type="spellEnd"/>
           </w:p>
         </w:tc>
         <w:tc>
@@ -3452,7 +4990,6 @@
                 <w:szCs w:val="18"/>
               </w:rPr>
             </w:pPr>
-            <w:proofErr w:type="spellStart"/>
             <w:r>
               <w:rPr>
                 <w:color w:val="3C4043"/>
@@ -3461,7 +4998,6 @@
               </w:rPr>
               <w:t>Hrs_CNA_ctr</w:t>
             </w:r>
-            <w:proofErr w:type="spellEnd"/>
           </w:p>
         </w:tc>
         <w:tc>
@@ -3568,7 +5104,6 @@
                 <w:szCs w:val="18"/>
               </w:rPr>
             </w:pPr>
-            <w:proofErr w:type="spellStart"/>
             <w:r>
               <w:rPr>
                 <w:color w:val="3C4043"/>
@@ -3577,7 +5112,6 @@
               </w:rPr>
               <w:t>Hrs_NAtrn</w:t>
             </w:r>
-            <w:proofErr w:type="spellEnd"/>
           </w:p>
         </w:tc>
         <w:tc>
@@ -3683,7 +5217,6 @@
                 <w:szCs w:val="18"/>
               </w:rPr>
             </w:pPr>
-            <w:proofErr w:type="spellStart"/>
             <w:r>
               <w:rPr>
                 <w:color w:val="3C4043"/>
@@ -3692,7 +5225,6 @@
               </w:rPr>
               <w:t>Hrs_NAtrn_emp</w:t>
             </w:r>
-            <w:proofErr w:type="spellEnd"/>
           </w:p>
         </w:tc>
         <w:tc>
@@ -3798,7 +5330,6 @@
                 <w:szCs w:val="18"/>
               </w:rPr>
             </w:pPr>
-            <w:proofErr w:type="spellStart"/>
             <w:r>
               <w:rPr>
                 <w:color w:val="3C4043"/>
@@ -3807,7 +5338,6 @@
               </w:rPr>
               <w:t>Hrs_NAtrn_ctr</w:t>
             </w:r>
-            <w:proofErr w:type="spellEnd"/>
           </w:p>
         </w:tc>
         <w:tc>
@@ -3913,7 +5443,6 @@
                 <w:szCs w:val="18"/>
               </w:rPr>
             </w:pPr>
-            <w:proofErr w:type="spellStart"/>
             <w:r>
               <w:rPr>
                 <w:color w:val="3C4043"/>
@@ -3922,7 +5451,6 @@
               </w:rPr>
               <w:t>Hrs_MedAide</w:t>
             </w:r>
-            <w:proofErr w:type="spellEnd"/>
           </w:p>
         </w:tc>
         <w:tc>
@@ -4028,7 +5556,6 @@
                 <w:szCs w:val="18"/>
               </w:rPr>
             </w:pPr>
-            <w:proofErr w:type="spellStart"/>
             <w:r>
               <w:rPr>
                 <w:color w:val="3C4043"/>
@@ -4037,7 +5564,6 @@
               </w:rPr>
               <w:t>Hrs_MedAide_emp</w:t>
             </w:r>
-            <w:proofErr w:type="spellEnd"/>
           </w:p>
         </w:tc>
         <w:tc>
@@ -4143,7 +5669,6 @@
                 <w:szCs w:val="18"/>
               </w:rPr>
             </w:pPr>
-            <w:proofErr w:type="spellStart"/>
             <w:r>
               <w:rPr>
                 <w:color w:val="3C4043"/>
@@ -4152,7 +5677,6 @@
               </w:rPr>
               <w:t>Hrs_MedAide_ctr</w:t>
             </w:r>
-            <w:proofErr w:type="spellEnd"/>
           </w:p>
         </w:tc>
         <w:tc>
@@ -4280,15 +5804,7 @@
         </w:rPr>
       </w:pPr>
       <w:r>
-        <w:t xml:space="preserve">Information about the columns </w:t>
-      </w:r>
-      <w:proofErr w:type="gramStart"/>
-      <w:r>
-        <w:t>are</w:t>
-      </w:r>
-      <w:proofErr w:type="gramEnd"/>
-      <w:r>
-        <w:t xml:space="preserve"> given </w:t>
+        <w:t xml:space="preserve">Information about the columns are given </w:t>
       </w:r>
       <w:hyperlink r:id="rId7">
         <w:r>
@@ -4406,15 +5922,7 @@
         <w:spacing w:line="360" w:lineRule="auto"/>
       </w:pPr>
       <w:r>
-        <w:t xml:space="preserve">Design </w:t>
-      </w:r>
-      <w:proofErr w:type="gramStart"/>
-      <w:r>
-        <w:t>a pipeline</w:t>
-      </w:r>
-      <w:proofErr w:type="gramEnd"/>
-      <w:r>
-        <w:t xml:space="preserve"> architecture for ingesting, transforming, and storing data.</w:t>
+        <w:t>Design a pipeline architecture for ingesting, transforming, and storing data.</w:t>
       </w:r>
     </w:p>
     <w:p>
@@ -4450,7 +5958,21 @@
             <w:color w:val="0000EE"/>
             <w:u w:val="single"/>
           </w:rPr>
-          <w:t>Data Lake Fundamentals</w:t>
+          <w:t>Data Lak</w:t>
+        </w:r>
+        <w:r>
+          <w:rPr>
+            <w:color w:val="0000EE"/>
+            <w:u w:val="single"/>
+          </w:rPr>
+          <w:t>e</w:t>
+        </w:r>
+        <w:r>
+          <w:rPr>
+            <w:color w:val="0000EE"/>
+            <w:u w:val="single"/>
+          </w:rPr>
+          <w:t xml:space="preserve"> Fundamentals</w:t>
         </w:r>
       </w:hyperlink>
     </w:p>
@@ -4482,25 +6004,7 @@
           <w:bCs/>
           <w:highlight w:val="yellow"/>
         </w:rPr>
-        <w:t xml:space="preserve">Consider your source as Google Drive </w:t>
-      </w:r>
-      <w:proofErr w:type="spellStart"/>
-      <w:r>
-        <w:rPr>
-          <w:b/>
-          <w:bCs/>
-          <w:highlight w:val="yellow"/>
-        </w:rPr>
-        <w:t>i.e</w:t>
-      </w:r>
-      <w:proofErr w:type="spellEnd"/>
-      <w:r>
-        <w:rPr>
-          <w:b/>
-          <w:bCs/>
-          <w:highlight w:val="yellow"/>
-        </w:rPr>
-        <w:t xml:space="preserve"> you need to ingest data from google drive incrementally.</w:t>
+        <w:t>Consider your source as Google Drive i.e you need to ingest data from google drive incrementally.</w:t>
       </w:r>
     </w:p>
     <w:p>
@@ -4601,23 +6105,7 @@
         <w:spacing w:after="300"/>
       </w:pPr>
       <w:r>
-        <w:t xml:space="preserve">Use tools like draw.io, </w:t>
-      </w:r>
-      <w:proofErr w:type="spellStart"/>
-      <w:r>
-        <w:t>miro</w:t>
-      </w:r>
-      <w:proofErr w:type="spellEnd"/>
-      <w:r>
-        <w:t xml:space="preserve">, </w:t>
-      </w:r>
-      <w:proofErr w:type="spellStart"/>
-      <w:r>
-        <w:t>etc</w:t>
-      </w:r>
-      <w:proofErr w:type="spellEnd"/>
-      <w:r>
-        <w:t xml:space="preserve"> for diagrams.</w:t>
+        <w:t>Use tools like draw.io, miro, etc for diagrams.</w:t>
       </w:r>
     </w:p>
     <w:p/>
@@ -4707,42 +6195,14 @@
         <w:rPr>
           <w:shd w:val="clear" w:color="auto" w:fill="E06666"/>
         </w:rPr>
-        <w:t xml:space="preserve">Disclaimer: You don't have data to solve all the </w:t>
-      </w:r>
-      <w:proofErr w:type="gramStart"/>
-      <w:r>
-        <w:rPr>
-          <w:shd w:val="clear" w:color="auto" w:fill="E06666"/>
-        </w:rPr>
-        <w:t>below metrics</w:t>
-      </w:r>
-      <w:proofErr w:type="gramEnd"/>
-      <w:r>
-        <w:rPr>
-          <w:shd w:val="clear" w:color="auto" w:fill="E06666"/>
-        </w:rPr>
-        <w:t>. You need to understand the data and identify which among them are calculatable and calculate those.</w:t>
+        <w:t>Disclaimer: You don't have data to solve all the below metrics. You need to understand the data and identify which among them are calculatable and calculate those.</w:t>
       </w:r>
       <w:r>
         <w:rPr>
           <w:shd w:val="clear" w:color="auto" w:fill="E06666"/>
         </w:rPr>
         <w:br/>
-        <w:t xml:space="preserve">We are </w:t>
-      </w:r>
-      <w:proofErr w:type="gramStart"/>
-      <w:r>
-        <w:rPr>
-          <w:shd w:val="clear" w:color="auto" w:fill="E06666"/>
-        </w:rPr>
-        <w:t>looking  at</w:t>
-      </w:r>
-      <w:proofErr w:type="gramEnd"/>
-      <w:r>
-        <w:rPr>
-          <w:shd w:val="clear" w:color="auto" w:fill="E06666"/>
-        </w:rPr>
-        <w:t xml:space="preserve"> 3-5 metrics to be solved</w:t>
+        <w:t>We are looking  at 3-5 metrics to be solved</w:t>
       </w:r>
     </w:p>
     <w:p>
@@ -5069,15 +6529,7 @@
         </w:numPr>
       </w:pPr>
       <w:r>
-        <w:t xml:space="preserve">Average cost per patient </w:t>
-      </w:r>
-      <w:proofErr w:type="gramStart"/>
-      <w:r>
-        <w:t>stay</w:t>
-      </w:r>
-      <w:proofErr w:type="gramEnd"/>
-      <w:r>
-        <w:t xml:space="preserve"> by hospital and state.</w:t>
+        <w:t>Average cost per patient stay by hospital and state.</w:t>
       </w:r>
     </w:p>
     <w:p>
@@ -5306,15 +6758,7 @@
         </w:numPr>
       </w:pPr>
       <w:r>
-        <w:t xml:space="preserve">Staffing insights (e.g., </w:t>
-      </w:r>
-      <w:proofErr w:type="gramStart"/>
-      <w:r>
-        <w:t>nurse-to-patient</w:t>
-      </w:r>
-      <w:proofErr w:type="gramEnd"/>
-      <w:r>
-        <w:t xml:space="preserve"> ratio).</w:t>
+        <w:t>Staffing insights (e.g., nurse-to-patient ratio).</w:t>
       </w:r>
     </w:p>
     <w:p>
@@ -5354,21 +6798,7 @@
         <w:rPr>
           <w:highlight w:val="yellow"/>
         </w:rPr>
-        <w:t xml:space="preserve">Please go through this link for working on </w:t>
-      </w:r>
-      <w:proofErr w:type="spellStart"/>
-      <w:r>
-        <w:rPr>
-          <w:highlight w:val="yellow"/>
-        </w:rPr>
-        <w:t>Streamlit</w:t>
-      </w:r>
-      <w:proofErr w:type="spellEnd"/>
-      <w:r>
-        <w:rPr>
-          <w:highlight w:val="yellow"/>
-        </w:rPr>
-        <w:t xml:space="preserve"> for Visualization:</w:t>
+        <w:t>Please go through this link for working on Streamlit for Visualization:</w:t>
       </w:r>
     </w:p>
     <w:p>
@@ -5376,21 +6806,26 @@
         <w:spacing w:before="300" w:after="300"/>
       </w:pPr>
       <w:hyperlink r:id="rId9">
-        <w:proofErr w:type="spellStart"/>
         <w:r>
           <w:rPr>
             <w:color w:val="1155CC"/>
             <w:u w:val="single"/>
           </w:rPr>
-          <w:t>Streamlit</w:t>
+          <w:t>Streamlit Tu</w:t>
         </w:r>
-        <w:proofErr w:type="spellEnd"/>
         <w:r>
           <w:rPr>
             <w:color w:val="1155CC"/>
             <w:u w:val="single"/>
           </w:rPr>
-          <w:t xml:space="preserve"> Tutorial</w:t>
+          <w:t>t</w:t>
+        </w:r>
+        <w:r>
+          <w:rPr>
+            <w:color w:val="1155CC"/>
+            <w:u w:val="single"/>
+          </w:rPr>
+          <w:t>orial</w:t>
         </w:r>
       </w:hyperlink>
     </w:p>
@@ -5556,15 +6991,7 @@
         <w:t>‘WHY</w:t>
       </w:r>
       <w:r>
-        <w:t xml:space="preserve">’ behind </w:t>
-      </w:r>
-      <w:proofErr w:type="gramStart"/>
-      <w:r>
-        <w:t>each and every</w:t>
-      </w:r>
-      <w:proofErr w:type="gramEnd"/>
-      <w:r>
-        <w:t xml:space="preserve"> tech stack used in your design.</w:t>
+        <w:t>’ behind each and every tech stack used in your design.</w:t>
       </w:r>
     </w:p>
     <w:p>
@@ -5654,15 +7081,7 @@
         <w:spacing w:after="300"/>
       </w:pPr>
       <w:r>
-        <w:t xml:space="preserve">What trends can you identify in patient length of stay </w:t>
-      </w:r>
-      <w:proofErr w:type="gramStart"/>
-      <w:r>
-        <w:t>over time</w:t>
-      </w:r>
-      <w:proofErr w:type="gramEnd"/>
-      <w:r>
-        <w:t>?</w:t>
+        <w:t>What trends can you identify in patient length of stay over time?</w:t>
       </w:r>
     </w:p>
     <w:p>
@@ -5675,15 +7094,7 @@
         <w:spacing w:before="300" w:after="300"/>
       </w:pPr>
       <w:r>
-        <w:t xml:space="preserve">If you have chosen any specific </w:t>
-      </w:r>
-      <w:proofErr w:type="gramStart"/>
-      <w:r>
-        <w:t>metrics</w:t>
-      </w:r>
-      <w:proofErr w:type="gramEnd"/>
-      <w:r>
-        <w:t xml:space="preserve"> you can have your own conclusion notes.</w:t>
+        <w:t>If you have chosen any specific metrics you can have your own conclusion notes.</w:t>
       </w:r>
     </w:p>
     <w:p>
@@ -7871,7 +9282,6 @@
   <w:style w:type="character" w:default="1" w:styleId="DefaultParagraphFont">
     <w:name w:val="Default Paragraph Font"/>
     <w:uiPriority w:val="1"/>
-    <w:semiHidden/>
     <w:unhideWhenUsed/>
   </w:style>
   <w:style w:type="table" w:default="1" w:styleId="TableNormal">
@@ -7939,7 +9349,8 @@
       <w:szCs w:val="30"/>
     </w:rPr>
   </w:style>
-  <w:style w:type="table" w:customStyle="1" w:styleId="a">
+  <w:style w:type="table" w:customStyle="1" w:styleId="1">
+    <w:name w:val="1"/>
     <w:basedOn w:val="TableNormal0"/>
     <w:tblPr>
       <w:tblStyleRowBandSize w:val="1"/>

</xml_diff>